<commit_message>
Office export from plain photos: flatten, high-res reading, line rereads
- Photos of a page on a desk are flattened like a scan (page detection,
  perspective, paper cleanup) and snapped to Letter/A4 before rebuilding
- Text is recognized from a higher-resolution copy; every line and table
  cell is reread on its own and accepted only for plausible corrections
- Page-relative bold threshold, stricter bullet dots, list items no longer
  swallow the next item, "81" → "B1" in code columns, consistent ranges
- Raw photo fixture and test with rendered outputs

Co-Authored-By: Claude Opus 5.5 <noreply@anthropic.com>
Claude-Session: https://claude.ai/code/session_01N2KPqXq9Whv7eR2vrvkBWC
</commit_message>
<xml_diff>
--- a/ios/Verification/office-layout/OfficeSamplePriceList.docx
+++ b/ios/Verification/office-layout/OfficeSamplePriceList.docx
@@ -1274,7 +1274,7 @@
           <w:sz w:val="21"/>
           <w:szCs w:val="21"/>
         </w:rPr>
-        <w:t xml:space="preserve"> trust'.</w:t>
+        <w:t xml:space="preserve"> trust.</w:t>
       </w:r>
     </w:p>
     <w:p>
@@ -1360,7 +1360,7 @@
           <w:sz w:val="29"/>
           <w:szCs w:val="29"/>
         </w:rPr>
-        <w:t xml:space="preserve">CONCERT</w:t>
+        <w:t xml:space="preserve">CONCERT®</w:t>
       </w:r>
     </w:p>
     <w:p>

</xml_diff>